<commit_message>
Add tests for text rendering and Word element coverage
- Enhance TextEngineTests to support customizable font family and weight in text rendering.
- Introduce BroadSyntheticOcrCases for comprehensive OCR testing with various font styles and weights.
- Implement WordElementCoverageTests to validate the export functionality of various Word elements including footnotes, endnotes, comments, bookmarks, and more.
- Add WordSecurityTests to ensure document protection, remote image fetching security, and digital signature correctness.
</commit_message>
<xml_diff>
--- a/tests/Canvas.Export.Tests/Fidelity/artifacts/latest/dense-table-ledger/word.docx
+++ b/tests/Canvas.Export.Tests/Fidelity/artifacts/latest/dense-table-ledger/word.docx
@@ -60,13 +60,9 @@
         </w:drawing>
       </w:r>
     </w:p>
-    <w:p>
-      <w:pPr>
-        <w:spacing w:before="320"/>
-      </w:pPr>
-    </w:p>
     <w:tbl>
       <w:tblPr>
+        <w:tblpPr w:leftFromText="0" w:rightFromText="0" w:topFromText="0" w:bottomFromText="0" w:vertAnchor="page" w:horzAnchor="page" w:tblpX="720" w:tblpY="1440"/>
         <w:tblW w:w="10600" w:type="dxa"/>
         <w:tblLayout w:type="fixed"/>
         <w:tblBorders>
@@ -77,7 +73,6 @@
           <w:insideH w:val="single" w:color="374151" w:sz="1"/>
           <w:insideV w:val="single" w:color="374151" w:sz="1"/>
         </w:tblBorders>
-        <w:tblInd w:w="720" w:type="dxa"/>
       </w:tblPr>
       <w:tblGrid>
         <w:gridCol w:w="1800"/>

</xml_diff>